<commit_message>
Diagrams & report fixed
</commit_message>
<xml_diff>
--- a/Lab0/Лабораторная_работа_0_Козлов_А_Д.docx
+++ b/Lab0/Лабораторная_работа_0_Козлов_А_Д.docx
@@ -39,8 +39,8 @@
                 <w:b/>
               </w:rPr>
             </w:pPr>
-            <w:bookmarkStart w:id="0" w:name="_Hlk134101536"/>
-            <w:bookmarkStart w:id="1" w:name="_Hlk134101558"/>
+            <w:bookmarkStart w:id="0" w:name="_Hlk134101558"/>
+            <w:bookmarkStart w:id="1" w:name="_Hlk134101536"/>
             <w:r>
               <w:rPr>
                 <w:b/>
@@ -1046,15 +1046,13 @@
         <w:t>”</w:t>
       </w:r>
       <w:r>
-        <w:t>. Считаем, что водитель уже вошел в свою учетную запись. Приложение пытается определить парковочную зону самостоятельно, используя геолокацию. Если это получилось, то зона подставляется автоматически. Если нет (</w:t>
+        <w:t>. Считаем, что водитель уже вошел в свою учетную запись. Приложение пытается определить парковочную зону самостоятельно, используя геолокацию. Если это получилось, то зона подставляется автоматически. Если нет (например</w:t>
       </w:r>
-      <w:proofErr w:type="gramStart"/>
       <w:r>
-        <w:t>например</w:t>
+        <w:t xml:space="preserve">, </w:t>
       </w:r>
-      <w:proofErr w:type="gramEnd"/>
       <w:r>
-        <w:t xml:space="preserve"> слабый сигнал </w:t>
+        <w:t xml:space="preserve">слабый сигнал </w:t>
       </w:r>
       <w:r>
         <w:rPr>
@@ -1205,10 +1203,10 @@
                 <w:noProof/>
               </w:rPr>
               <w:drawing>
-                <wp:inline distT="0" distB="0" distL="0" distR="0" wp14:anchorId="498B5F47" wp14:editId="2CEFB2C0">
-                  <wp:extent cx="5760000" cy="5040231"/>
-                  <wp:effectExtent l="0" t="0" r="0" b="8255"/>
-                  <wp:docPr id="1480304398" name="Рисунок 2"/>
+                <wp:inline distT="0" distB="0" distL="0" distR="0" wp14:anchorId="69D4BD52" wp14:editId="41B9409D">
+                  <wp:extent cx="5760000" cy="4723138"/>
+                  <wp:effectExtent l="0" t="0" r="0" b="1270"/>
+                  <wp:docPr id="1894109967" name="Рисунок 1"/>
                   <wp:cNvGraphicFramePr>
                     <a:graphicFrameLocks xmlns:a="http://schemas.openxmlformats.org/drawingml/2006/main" noChangeAspect="1"/>
                   </wp:cNvGraphicFramePr>
@@ -1216,7 +1214,7 @@
                     <a:graphicData uri="http://schemas.openxmlformats.org/drawingml/2006/picture">
                       <pic:pic xmlns:pic="http://schemas.openxmlformats.org/drawingml/2006/picture">
                         <pic:nvPicPr>
-                          <pic:cNvPr id="0" name="Picture 3"/>
+                          <pic:cNvPr id="0" name="Picture 1"/>
                           <pic:cNvPicPr>
                             <a:picLocks noChangeAspect="1" noChangeArrowheads="1"/>
                           </pic:cNvPicPr>
@@ -1237,7 +1235,7 @@
                         <pic:spPr bwMode="auto">
                           <a:xfrm>
                             <a:off x="0" y="0"/>
-                            <a:ext cx="5760000" cy="5040231"/>
+                            <a:ext cx="5760000" cy="4723138"/>
                           </a:xfrm>
                           <a:prstGeom prst="rect">
                             <a:avLst/>
@@ -1329,10 +1327,10 @@
                 <w:noProof/>
               </w:rPr>
               <w:drawing>
-                <wp:inline distT="0" distB="0" distL="0" distR="0" wp14:anchorId="4CDFA8C3" wp14:editId="5099EF58">
-                  <wp:extent cx="5760000" cy="5529723"/>
+                <wp:inline distT="0" distB="0" distL="0" distR="0" wp14:anchorId="0D4CEF39" wp14:editId="4F3D9295">
+                  <wp:extent cx="5760000" cy="4572904"/>
                   <wp:effectExtent l="0" t="0" r="0" b="0"/>
-                  <wp:docPr id="1672972005" name="Рисунок 3"/>
+                  <wp:docPr id="334055632" name="Рисунок 2"/>
                   <wp:cNvGraphicFramePr>
                     <a:graphicFrameLocks xmlns:a="http://schemas.openxmlformats.org/drawingml/2006/main" noChangeAspect="1"/>
                   </wp:cNvGraphicFramePr>
@@ -1340,7 +1338,7 @@
                     <a:graphicData uri="http://schemas.openxmlformats.org/drawingml/2006/picture">
                       <pic:pic xmlns:pic="http://schemas.openxmlformats.org/drawingml/2006/picture">
                         <pic:nvPicPr>
-                          <pic:cNvPr id="0" name="Picture 5"/>
+                          <pic:cNvPr id="0" name="Picture 3"/>
                           <pic:cNvPicPr>
                             <a:picLocks noChangeAspect="1" noChangeArrowheads="1"/>
                           </pic:cNvPicPr>
@@ -1361,7 +1359,7 @@
                         <pic:spPr bwMode="auto">
                           <a:xfrm>
                             <a:off x="0" y="0"/>
-                            <a:ext cx="5760000" cy="5529723"/>
+                            <a:ext cx="5760000" cy="4572904"/>
                           </a:xfrm>
                           <a:prstGeom prst="rect">
                             <a:avLst/>
@@ -1576,7 +1574,7 @@
               <w:rPr>
                 <w:rFonts w:eastAsia="Calibri" w:cs="Times New Roman"/>
               </w:rPr>
-              <w:t>приложение "Парковки машин" открыто</w:t>
+              <w:t>приложение «Парковки машин» открыто</w:t>
             </w:r>
           </w:p>
         </w:tc>
@@ -1625,7 +1623,7 @@
               <w:rPr>
                 <w:rFonts w:eastAsia="Calibri" w:cs="Times New Roman"/>
               </w:rPr>
-              <w:t>парковочная зона определена</w:t>
+              <w:t>ожидание ответа банка о платеже</w:t>
             </w:r>
           </w:p>
         </w:tc>
@@ -1670,117 +1668,19 @@
                 <w:rFonts w:eastAsia="Calibri" w:cs="Times New Roman"/>
               </w:rPr>
             </w:pPr>
+            <w:proofErr w:type="spellStart"/>
             <w:r>
               <w:rPr>
                 <w:rFonts w:eastAsia="Calibri" w:cs="Times New Roman"/>
               </w:rPr>
-              <w:t>параметры парковки заданы</w:t>
-            </w:r>
-          </w:p>
-        </w:tc>
-      </w:tr>
-      <w:tr>
-        <w:trPr>
-          <w:trHeight w:val="454"/>
-        </w:trPr>
-        <w:tc>
-          <w:tcPr>
-            <w:tcW w:w="4672" w:type="dxa"/>
-            <w:vAlign w:val="center"/>
-          </w:tcPr>
-          <w:p>
-            <w:pPr>
-              <w:spacing w:before="0" w:after="0" w:line="240" w:lineRule="auto"/>
-              <w:ind w:firstLine="0"/>
-              <w:jc w:val="center"/>
+              <w:t>Push</w:t>
+            </w:r>
+            <w:proofErr w:type="spellEnd"/>
+            <w:r>
               <w:rPr>
                 <w:rFonts w:eastAsia="Calibri" w:cs="Times New Roman"/>
               </w:rPr>
-            </w:pPr>
-            <w:r>
-              <w:rPr>
-                <w:rFonts w:eastAsia="Calibri" w:cs="Times New Roman"/>
-              </w:rPr>
-              <w:t>s5</w:t>
-            </w:r>
-          </w:p>
-        </w:tc>
-        <w:tc>
-          <w:tcPr>
-            <w:tcW w:w="4673" w:type="dxa"/>
-            <w:vAlign w:val="center"/>
-          </w:tcPr>
-          <w:p>
-            <w:pPr>
-              <w:spacing w:before="0" w:after="0" w:line="240" w:lineRule="auto"/>
-              <w:ind w:firstLine="0"/>
-              <w:jc w:val="center"/>
-              <w:rPr>
-                <w:rFonts w:eastAsia="Calibri" w:cs="Times New Roman"/>
-              </w:rPr>
-            </w:pPr>
-            <w:r>
-              <w:rPr>
-                <w:rFonts w:eastAsia="Calibri" w:cs="Times New Roman"/>
-              </w:rPr>
-              <w:t>оплата прошла</w:t>
-            </w:r>
-          </w:p>
-        </w:tc>
-      </w:tr>
-      <w:tr>
-        <w:trPr>
-          <w:trHeight w:val="454"/>
-        </w:trPr>
-        <w:tc>
-          <w:tcPr>
-            <w:tcW w:w="4672" w:type="dxa"/>
-            <w:vAlign w:val="center"/>
-          </w:tcPr>
-          <w:p>
-            <w:pPr>
-              <w:spacing w:before="0" w:after="0" w:line="240" w:lineRule="auto"/>
-              <w:ind w:firstLine="0"/>
-              <w:jc w:val="center"/>
-              <w:rPr>
-                <w:rFonts w:eastAsia="Calibri" w:cs="Times New Roman"/>
-              </w:rPr>
-            </w:pPr>
-            <w:r>
-              <w:rPr>
-                <w:rFonts w:eastAsia="Calibri" w:cs="Times New Roman"/>
-              </w:rPr>
-              <w:t>s6</w:t>
-            </w:r>
-          </w:p>
-        </w:tc>
-        <w:tc>
-          <w:tcPr>
-            <w:tcW w:w="4673" w:type="dxa"/>
-            <w:vAlign w:val="center"/>
-          </w:tcPr>
-          <w:p>
-            <w:pPr>
-              <w:spacing w:before="0" w:after="0" w:line="240" w:lineRule="auto"/>
-              <w:ind w:firstLine="0"/>
-              <w:jc w:val="center"/>
-              <w:rPr>
-                <w:rFonts w:eastAsia="Calibri" w:cs="Times New Roman"/>
-              </w:rPr>
-            </w:pPr>
-            <w:proofErr w:type="spellStart"/>
-            <w:r>
-              <w:rPr>
-                <w:rFonts w:eastAsia="Calibri" w:cs="Times New Roman"/>
-              </w:rPr>
-              <w:t>Push</w:t>
-            </w:r>
-            <w:proofErr w:type="spellEnd"/>
-            <w:r>
-              <w:rPr>
-                <w:rFonts w:eastAsia="Calibri" w:cs="Times New Roman"/>
-              </w:rPr>
-              <w:t>-уведомление об успешной оплате получено</w:t>
+              <w:t>-уведомление об успешной оплате получено, списание времени начато</w:t>
             </w:r>
           </w:p>
         </w:tc>
@@ -1871,7 +1771,7 @@
               <w:rPr>
                 <w:rFonts w:eastAsia="Calibri" w:cs="Times New Roman"/>
               </w:rPr>
-              <w:t>запуск приложения "Парковки машин"</w:t>
+              <w:t>запуск приложения «Парковки машин»</w:t>
             </w:r>
           </w:p>
         </w:tc>
@@ -2067,7 +1967,7 @@
               <w:rPr>
                 <w:rFonts w:eastAsia="Calibri" w:cs="Times New Roman"/>
               </w:rPr>
-              <w:t>нажатие кнопки "Оплатить", отправка платежа с банковской карты</w:t>
+              <w:t>нажатие кнопки «Оплатить», отправка платежа с банковской карты</w:t>
             </w:r>
           </w:p>
         </w:tc>
@@ -2165,7 +2065,7 @@
               <w:rPr>
                 <w:rFonts w:eastAsia="Calibri" w:cs="Times New Roman"/>
               </w:rPr>
-              <w:t>пополнение счёта карты (возврат к s4 для повторной оплаты)</w:t>
+              <w:t>пополнение счёта карты (возврат к e5 для повторной оплаты)</w:t>
             </w:r>
           </w:p>
         </w:tc>
@@ -2369,6 +2269,55 @@
                 <w:rFonts w:eastAsia="Calibri" w:cs="Times New Roman"/>
               </w:rPr>
               <w:t>на карте достаточно средств (инверсия: недостаточно)</w:t>
+            </w:r>
+          </w:p>
+        </w:tc>
+      </w:tr>
+      <w:tr>
+        <w:trPr>
+          <w:trHeight w:val="454"/>
+        </w:trPr>
+        <w:tc>
+          <w:tcPr>
+            <w:tcW w:w="4672" w:type="dxa"/>
+            <w:vAlign w:val="center"/>
+          </w:tcPr>
+          <w:p>
+            <w:pPr>
+              <w:spacing w:before="0" w:after="0" w:line="240" w:lineRule="auto"/>
+              <w:ind w:firstLine="0"/>
+              <w:jc w:val="center"/>
+              <w:rPr>
+                <w:rFonts w:eastAsia="Calibri" w:cs="Times New Roman"/>
+              </w:rPr>
+            </w:pPr>
+            <w:r>
+              <w:rPr>
+                <w:rFonts w:eastAsia="Calibri" w:cs="Times New Roman"/>
+              </w:rPr>
+              <w:t>p3</w:t>
+            </w:r>
+          </w:p>
+        </w:tc>
+        <w:tc>
+          <w:tcPr>
+            <w:tcW w:w="4673" w:type="dxa"/>
+            <w:vAlign w:val="center"/>
+          </w:tcPr>
+          <w:p>
+            <w:pPr>
+              <w:spacing w:before="0" w:after="0" w:line="240" w:lineRule="auto"/>
+              <w:ind w:firstLine="0"/>
+              <w:jc w:val="center"/>
+              <w:rPr>
+                <w:rFonts w:eastAsia="Calibri" w:cs="Times New Roman"/>
+              </w:rPr>
+            </w:pPr>
+            <w:r>
+              <w:rPr>
+                <w:rFonts w:eastAsia="Calibri" w:cs="Times New Roman"/>
+              </w:rPr>
+              <w:t>в зоне действует платный режим парковки</w:t>
             </w:r>
           </w:p>
         </w:tc>

</xml_diff>